<commit_message>
Melanjutkan kodingan dan tambah fitur dari laptop
</commit_message>
<xml_diff>
--- a/SERTIFIKAT.docx
+++ b/SERTIFIKAT.docx
@@ -15,7 +15,6 @@
           <w:szCs w:val="56"/>
         </w:rPr>
       </w:pPr>
-      <w:bookmarkStart w:id="0" w:name="_GoBack"/>
     </w:p>
     <w:p>
       <w:pPr>
@@ -39,6 +38,10 @@
         <w:pStyle w:val="NormalWeb"/>
         <w:spacing w:before="0" w:beforeAutospacing="0" w:after="0" w:afterAutospacing="0"/>
         <w:jc w:val="center"/>
+        <w:rPr>
+          <w:sz w:val="36"/>
+          <w:szCs w:val="36"/>
+        </w:rPr>
       </w:pPr>
       <w:r>
         <w:rPr>
@@ -70,6 +73,10 @@
         <w:pStyle w:val="NormalWeb"/>
         <w:spacing w:before="0" w:beforeAutospacing="0" w:after="0" w:afterAutospacing="0"/>
         <w:jc w:val="center"/>
+        <w:rPr>
+          <w:sz w:val="36"/>
+          <w:szCs w:val="36"/>
+        </w:rPr>
       </w:pPr>
       <w:r>
         <w:rPr>
@@ -90,26 +97,63 @@
           <w:tab w:val="left" w:pos="5954"/>
         </w:tabs>
         <w:spacing w:before="0" w:beforeAutospacing="0" w:after="0" w:afterAutospacing="0"/>
+        <w:jc w:val="center"/>
+        <w:rPr>
+          <w:sz w:val="36"/>
+          <w:szCs w:val="36"/>
+        </w:rPr>
+      </w:pPr>
+      <w:r>
+        <w:rPr>
+          <w:rFonts w:asciiTheme="minorHAnsi" w:eastAsiaTheme="minorEastAsia" w:hAnsi="Calibri" w:cstheme="minorBidi"/>
+          <w:color w:val="000000" w:themeColor="text1"/>
+          <w:kern w:val="24"/>
+          <w:sz w:val="36"/>
+          <w:szCs w:val="36"/>
+        </w:rPr>
+        <w:t>Nama:</w:t>
+      </w:r>
+    </w:p>
+    <w:p>
+      <w:pPr>
+        <w:pStyle w:val="NormalWeb"/>
+        <w:spacing w:before="0" w:beforeAutospacing="0" w:after="0" w:afterAutospacing="0"/>
+        <w:ind w:left="6379"/>
         <w:jc w:val="both"/>
-      </w:pPr>
-      <w:r>
-        <w:rPr>
-          <w:rFonts w:asciiTheme="minorHAnsi" w:eastAsiaTheme="minorEastAsia" w:hAnsi="Calibri" w:cstheme="minorBidi"/>
-          <w:color w:val="000000" w:themeColor="text1"/>
-          <w:kern w:val="24"/>
-          <w:sz w:val="40"/>
-          <w:szCs w:val="40"/>
+        <w:rPr>
+          <w:sz w:val="36"/>
+          <w:szCs w:val="36"/>
+        </w:rPr>
+      </w:pPr>
+      <w:r>
+        <w:rPr>
+          <w:rFonts w:asciiTheme="minorHAnsi" w:eastAsiaTheme="minorEastAsia" w:hAnsi="Calibri" w:cstheme="minorBidi"/>
+          <w:color w:val="000000" w:themeColor="text1"/>
+          <w:kern w:val="24"/>
+          <w:sz w:val="36"/>
+          <w:szCs w:val="36"/>
         </w:rPr>
         <w:tab/>
-        <w:t>Nama</w:t>
-      </w:r>
-      <w:r>
-        <w:rPr>
-          <w:rFonts w:asciiTheme="minorHAnsi" w:eastAsiaTheme="minorEastAsia" w:hAnsi="Calibri" w:cstheme="minorBidi"/>
-          <w:color w:val="000000" w:themeColor="text1"/>
-          <w:kern w:val="24"/>
-          <w:sz w:val="40"/>
-          <w:szCs w:val="40"/>
+      </w:r>
+      <w:bookmarkStart w:id="0" w:name="_GoBack"/>
+      <w:bookmarkEnd w:id="0"/>
+      <w:r>
+        <w:rPr>
+          <w:rFonts w:asciiTheme="minorHAnsi" w:eastAsiaTheme="minorEastAsia" w:hAnsi="Calibri" w:cstheme="minorBidi"/>
+          <w:color w:val="000000" w:themeColor="text1"/>
+          <w:kern w:val="24"/>
+          <w:sz w:val="36"/>
+          <w:szCs w:val="36"/>
+        </w:rPr>
+        <w:t>NIP/NIK</w:t>
+      </w:r>
+      <w:r>
+        <w:rPr>
+          <w:rFonts w:asciiTheme="minorHAnsi" w:eastAsiaTheme="minorEastAsia" w:hAnsi="Calibri" w:cstheme="minorBidi"/>
+          <w:color w:val="000000" w:themeColor="text1"/>
+          <w:kern w:val="24"/>
+          <w:sz w:val="36"/>
+          <w:szCs w:val="36"/>
         </w:rPr>
         <w:tab/>
         <w:t>:</w:t>
@@ -124,25 +168,29 @@
         </w:tabs>
         <w:spacing w:before="0" w:beforeAutospacing="0" w:after="0" w:afterAutospacing="0"/>
         <w:jc w:val="both"/>
-      </w:pPr>
-      <w:r>
-        <w:rPr>
-          <w:rFonts w:asciiTheme="minorHAnsi" w:eastAsiaTheme="minorEastAsia" w:hAnsi="Calibri" w:cstheme="minorBidi"/>
-          <w:color w:val="000000" w:themeColor="text1"/>
-          <w:kern w:val="24"/>
-          <w:sz w:val="40"/>
-          <w:szCs w:val="40"/>
+        <w:rPr>
+          <w:sz w:val="36"/>
+          <w:szCs w:val="36"/>
+        </w:rPr>
+      </w:pPr>
+      <w:r>
+        <w:rPr>
+          <w:rFonts w:asciiTheme="minorHAnsi" w:eastAsiaTheme="minorEastAsia" w:hAnsi="Calibri" w:cstheme="minorBidi"/>
+          <w:color w:val="000000" w:themeColor="text1"/>
+          <w:kern w:val="24"/>
+          <w:sz w:val="36"/>
+          <w:szCs w:val="36"/>
         </w:rPr>
         <w:tab/>
-        <w:t>NIP/NIK</w:t>
-      </w:r>
-      <w:r>
-        <w:rPr>
-          <w:rFonts w:asciiTheme="minorHAnsi" w:eastAsiaTheme="minorEastAsia" w:hAnsi="Calibri" w:cstheme="minorBidi"/>
-          <w:color w:val="000000" w:themeColor="text1"/>
-          <w:kern w:val="24"/>
-          <w:sz w:val="40"/>
-          <w:szCs w:val="40"/>
+        <w:t>Jabatan</w:t>
+      </w:r>
+      <w:r>
+        <w:rPr>
+          <w:rFonts w:asciiTheme="minorHAnsi" w:eastAsiaTheme="minorEastAsia" w:hAnsi="Calibri" w:cstheme="minorBidi"/>
+          <w:color w:val="000000" w:themeColor="text1"/>
+          <w:kern w:val="24"/>
+          <w:sz w:val="36"/>
+          <w:szCs w:val="36"/>
         </w:rPr>
         <w:tab/>
         <w:t>:</w:t>
@@ -157,25 +205,29 @@
         </w:tabs>
         <w:spacing w:before="0" w:beforeAutospacing="0" w:after="0" w:afterAutospacing="0"/>
         <w:jc w:val="both"/>
-      </w:pPr>
-      <w:r>
-        <w:rPr>
-          <w:rFonts w:asciiTheme="minorHAnsi" w:eastAsiaTheme="minorEastAsia" w:hAnsi="Calibri" w:cstheme="minorBidi"/>
-          <w:color w:val="000000" w:themeColor="text1"/>
-          <w:kern w:val="24"/>
-          <w:sz w:val="40"/>
-          <w:szCs w:val="40"/>
+        <w:rPr>
+          <w:sz w:val="36"/>
+          <w:szCs w:val="36"/>
+        </w:rPr>
+      </w:pPr>
+      <w:r>
+        <w:rPr>
+          <w:rFonts w:asciiTheme="minorHAnsi" w:eastAsiaTheme="minorEastAsia" w:hAnsi="Calibri" w:cstheme="minorBidi"/>
+          <w:color w:val="000000" w:themeColor="text1"/>
+          <w:kern w:val="24"/>
+          <w:sz w:val="36"/>
+          <w:szCs w:val="36"/>
         </w:rPr>
         <w:tab/>
-        <w:t>Jabatan</w:t>
-      </w:r>
-      <w:r>
-        <w:rPr>
-          <w:rFonts w:asciiTheme="minorHAnsi" w:eastAsiaTheme="minorEastAsia" w:hAnsi="Calibri" w:cstheme="minorBidi"/>
-          <w:color w:val="000000" w:themeColor="text1"/>
-          <w:kern w:val="24"/>
-          <w:sz w:val="40"/>
-          <w:szCs w:val="40"/>
+        <w:t>Satuan Kerja</w:t>
+      </w:r>
+      <w:r>
+        <w:rPr>
+          <w:rFonts w:asciiTheme="minorHAnsi" w:eastAsiaTheme="minorEastAsia" w:hAnsi="Calibri" w:cstheme="minorBidi"/>
+          <w:color w:val="000000" w:themeColor="text1"/>
+          <w:kern w:val="24"/>
+          <w:sz w:val="36"/>
+          <w:szCs w:val="36"/>
         </w:rPr>
         <w:tab/>
         <w:t>:</w:t>
@@ -184,55 +236,26 @@
     <w:p>
       <w:pPr>
         <w:pStyle w:val="NormalWeb"/>
-        <w:tabs>
-          <w:tab w:val="left" w:pos="3686"/>
-          <w:tab w:val="left" w:pos="5954"/>
-        </w:tabs>
-        <w:spacing w:before="0" w:beforeAutospacing="0" w:after="0" w:afterAutospacing="0"/>
-        <w:jc w:val="both"/>
-      </w:pPr>
-      <w:r>
-        <w:rPr>
-          <w:rFonts w:asciiTheme="minorHAnsi" w:eastAsiaTheme="minorEastAsia" w:hAnsi="Calibri" w:cstheme="minorBidi"/>
-          <w:color w:val="000000" w:themeColor="text1"/>
-          <w:kern w:val="24"/>
-          <w:sz w:val="40"/>
-          <w:szCs w:val="40"/>
-        </w:rPr>
-        <w:tab/>
-        <w:t>Satuan Kerja</w:t>
-      </w:r>
-      <w:r>
-        <w:rPr>
-          <w:rFonts w:asciiTheme="minorHAnsi" w:eastAsiaTheme="minorEastAsia" w:hAnsi="Calibri" w:cstheme="minorBidi"/>
-          <w:color w:val="000000" w:themeColor="text1"/>
-          <w:kern w:val="24"/>
-          <w:sz w:val="40"/>
-          <w:szCs w:val="40"/>
-        </w:rPr>
-        <w:tab/>
-        <w:t>:</w:t>
-      </w:r>
-    </w:p>
-    <w:p>
-      <w:pPr>
-        <w:pStyle w:val="NormalWeb"/>
-        <w:spacing w:before="0" w:beforeAutospacing="0" w:after="0" w:afterAutospacing="0"/>
-        <w:jc w:val="center"/>
-        <w:rPr>
-          <w:rFonts w:asciiTheme="minorHAnsi" w:eastAsiaTheme="minorEastAsia" w:hAnsi="Calibri" w:cstheme="minorBidi"/>
-          <w:color w:val="000000" w:themeColor="text1"/>
-          <w:kern w:val="24"/>
-          <w:sz w:val="36"/>
-          <w:szCs w:val="36"/>
-        </w:rPr>
-      </w:pPr>
-    </w:p>
-    <w:p>
-      <w:pPr>
-        <w:pStyle w:val="NormalWeb"/>
-        <w:spacing w:before="0" w:beforeAutospacing="0" w:after="0" w:afterAutospacing="0"/>
-        <w:jc w:val="center"/>
+        <w:spacing w:before="0" w:beforeAutospacing="0" w:after="0" w:afterAutospacing="0"/>
+        <w:jc w:val="center"/>
+        <w:rPr>
+          <w:rFonts w:asciiTheme="minorHAnsi" w:eastAsiaTheme="minorEastAsia" w:hAnsi="Calibri" w:cstheme="minorBidi"/>
+          <w:color w:val="000000" w:themeColor="text1"/>
+          <w:kern w:val="24"/>
+          <w:sz w:val="36"/>
+          <w:szCs w:val="36"/>
+        </w:rPr>
+      </w:pPr>
+    </w:p>
+    <w:p>
+      <w:pPr>
+        <w:pStyle w:val="NormalWeb"/>
+        <w:spacing w:before="0" w:beforeAutospacing="0" w:after="0" w:afterAutospacing="0"/>
+        <w:jc w:val="center"/>
+        <w:rPr>
+          <w:sz w:val="36"/>
+          <w:szCs w:val="36"/>
+        </w:rPr>
       </w:pPr>
       <w:r>
         <w:rPr>
@@ -250,6 +273,10 @@
         <w:pStyle w:val="NormalWeb"/>
         <w:spacing w:before="0" w:beforeAutospacing="0" w:after="0" w:afterAutospacing="0"/>
         <w:jc w:val="center"/>
+        <w:rPr>
+          <w:sz w:val="36"/>
+          <w:szCs w:val="36"/>
+        </w:rPr>
       </w:pPr>
       <w:r>
         <w:rPr>
@@ -267,6 +294,10 @@
         <w:pStyle w:val="NormalWeb"/>
         <w:spacing w:before="0" w:beforeAutospacing="0" w:after="0" w:afterAutospacing="0"/>
         <w:jc w:val="center"/>
+        <w:rPr>
+          <w:sz w:val="36"/>
+          <w:szCs w:val="36"/>
+        </w:rPr>
       </w:pPr>
       <w:r>
         <w:rPr>
@@ -298,6 +329,10 @@
         <w:pStyle w:val="NormalWeb"/>
         <w:spacing w:before="0" w:beforeAutospacing="0" w:after="0" w:afterAutospacing="0"/>
         <w:jc w:val="center"/>
+        <w:rPr>
+          <w:sz w:val="36"/>
+          <w:szCs w:val="36"/>
+        </w:rPr>
       </w:pPr>
       <w:r>
         <w:rPr>
@@ -347,6 +382,10 @@
         <w:pStyle w:val="NormalWeb"/>
         <w:spacing w:before="0" w:beforeAutospacing="0" w:after="78" w:afterAutospacing="0"/>
         <w:jc w:val="center"/>
+        <w:rPr>
+          <w:sz w:val="36"/>
+          <w:szCs w:val="36"/>
+        </w:rPr>
       </w:pPr>
       <w:r>
         <w:rPr>
@@ -371,10 +410,9 @@
         <w:br/>
         <w:t>NIP. 196904031998032004</w:t>
       </w:r>
-      <w:bookmarkEnd w:id="0"/>
     </w:p>
     <w:sectPr>
-      <w:pgSz w:w="16838" w:h="11906" w:orient="landscape"/>
+      <w:pgSz w:w="16838" w:h="11906" w:orient="landscape" w:code="9"/>
       <w:pgMar w:top="1440" w:right="1440" w:bottom="1440" w:left="1440" w:header="708" w:footer="708" w:gutter="0"/>
       <w:cols w:space="708"/>
       <w:docGrid w:linePitch="360"/>

</xml_diff>